<commit_message>
analysis: figure one as prediction score (t-test, mean + 95% box), tool-call count in the deterministic features, no-self-judging figure, core-condition fix
Figure one (figures/bars/figure1_*): prediction score = 1 - pooled squared error / the
saturated-item prediction's per target model; circle at the mean, box the 95% t-interval, stars
from a one-sample t-test of the scores against 0; axis -0.5 to 1; paper protocol names from one
LABELS dict; Length alone dropped from paper figures; a variant judged by the best judge outside
the target's developer family.

Deterministic features: log_tool_calls joins FEATURE_SETS["regex"] (13 features).

Core condition and unfetched-LFS handling as on main (a18509e); the signal GLM sampler draws
raised to 2000 per chain; generalisation design and runner; channel configs; supplement docs.
</commit_message>
<xml_diff>
--- a/docs/2026-09-17-signal-glm-supplement.docx
+++ b/docs/2026-09-17-signal-glm-supplement.docx
@@ -108,7 +108,7 @@
         <w:t xml:space="preserve">Fit. </w:t>
       </w:r>
       <w:r>
-        <w:t xml:space="preserve">0 divergences, r_hat ≤ 1.01, bulk ESS ≥ 923, 8 of 384 rows with Pareto-k &gt; 0.7, Bayesian R² on the log scale 0.35, 95% predictive coverage 0.94 to 0.97 per protocol.</w:t>
+        <w:t xml:space="preserve">0 divergences, r_hat ≤ 1.006, bulk ESS ≥ 923, 8 of 384 rows with Pareto-k &gt; 0.7, Bayesian R² on the log scale 0.35, 95% predictive coverage 0.94 to 0.97 per protocol.</w:t>
       </w:r>
     </w:p>
     <w:p>
@@ -3454,7 +3454,7 @@
       <w:r>
         <w:drawing>
           <wp:inline distT="0" distB="0" distL="0" distR="0">
-            <wp:extent cx="4381500" cy="3638550"/>
+            <wp:extent cx="4381500" cy="3600450"/>
             <wp:effectExtent t="0" r="0" b="0" l="0"/>
             <wp:docPr id="1" name="" descr="" title=""/>
             <wp:cNvGraphicFramePr>
@@ -3479,7 +3479,7 @@
                   <pic:spPr bwMode="auto">
                     <a:xfrm>
                       <a:off x="0" y="0"/>
-                      <a:ext cx="4381500" cy="3638550"/>
+                      <a:ext cx="4381500" cy="3600450"/>
                     </a:xfrm>
                     <a:prstGeom prst="rect">
                       <a:avLst/>
@@ -3502,7 +3502,7 @@
           <w:sz w:val="18"/>
           <w:szCs w:val="18"/>
         </w:rPr>
-        <w:t xml:space="preserve">Posterior densities of the pooled protocol effects (top left), the domain effects (top right) and each protocol's four domain deviations (bottom).</w:t>
+        <w:t xml:space="preserve">Posterior densities on the prediction-score scale (100 · (1 − error ratio); above 0 beats the baseline): the pooled protocol effects (top left), the baseline's error by domain relative to the grand mean (top right, a ratio), and each protocol's effect per domain (bottom). Bars: median and 95% interval. The same figure on the error-ratio scale is posteriors.png.</w:t>
       </w:r>
     </w:p>
     <w:p>
@@ -5190,7 +5190,7 @@
                 <w:sz w:val="18"/>
                 <w:szCs w:val="18"/>
               </w:rPr>
-              <w:t xml:space="preserve">0.000</w:t>
+              <w:t xml:space="preserve">0.0000</w:t>
             </w:r>
           </w:p>
         </w:tc>
@@ -5215,7 +5215,7 @@
                 <w:sz w:val="18"/>
                 <w:szCs w:val="18"/>
               </w:rPr>
-              <w:t xml:space="preserve">0.000</w:t>
+              <w:t xml:space="preserve">0.0000</w:t>
             </w:r>
           </w:p>
         </w:tc>
@@ -5292,7 +5292,7 @@
                 <w:sz w:val="18"/>
                 <w:szCs w:val="18"/>
               </w:rPr>
-              <w:t xml:space="preserve">1.010</w:t>
+              <w:t xml:space="preserve">1.0060</w:t>
             </w:r>
           </w:p>
         </w:tc>
@@ -5317,7 +5317,7 @@
                 <w:sz w:val="18"/>
                 <w:szCs w:val="18"/>
               </w:rPr>
-              <w:t xml:space="preserve">1.000</w:t>
+              <w:t xml:space="preserve">1.0044</w:t>
             </w:r>
           </w:p>
         </w:tc>
@@ -5598,7 +5598,7 @@
                 <w:sz w:val="18"/>
                 <w:szCs w:val="18"/>
               </w:rPr>
-              <w:t xml:space="preserve">6.000 / 2.000 of 384</w:t>
+              <w:t xml:space="preserve">6.0000 / 2.0000 of 384</w:t>
             </w:r>
           </w:p>
         </w:tc>
@@ -5623,7 +5623,7 @@
                 <w:sz w:val="18"/>
                 <w:szCs w:val="18"/>
               </w:rPr>
-              <w:t xml:space="preserve">4.000 / 2.000 of 384</w:t>
+              <w:t xml:space="preserve">4.0000 / 2.0000 of 384</w:t>
             </w:r>
           </w:p>
         </w:tc>
@@ -5769,7 +5769,7 @@
       <w:r>
         <w:drawing>
           <wp:inline distT="0" distB="0" distL="0" distR="0">
-            <wp:extent cx="4381500" cy="1066800"/>
+            <wp:extent cx="4476750" cy="3838575"/>
             <wp:effectExtent t="0" r="0" b="0" l="0"/>
             <wp:docPr id="1" name="" descr="" title=""/>
             <wp:cNvGraphicFramePr>
@@ -5794,7 +5794,7 @@
                   <pic:spPr bwMode="auto">
                     <a:xfrm>
                       <a:off x="0" y="0"/>
-                      <a:ext cx="4381500" cy="1066800"/>
+                      <a:ext cx="4476750" cy="3838575"/>
                     </a:xfrm>
                     <a:prstGeom prst="rect">
                       <a:avLst/>
@@ -5817,66 +5817,7 @@
           <w:sz w:val="18"/>
           <w:szCs w:val="18"/>
         </w:rPr>
-        <w:t xml:space="preserve">Posterior predictive check, m2: observed density of log squared error per protocol (dark) against 200 replicated datasets (light). The model reproduces the location, width and skew of each protocol's error distribution.</w:t>
-      </w:r>
-    </w:p>
-    <w:p>
-      <w:pPr>
-        <w:spacing w:after="60"/>
-        <w:jc w:val="center"/>
-      </w:pPr>
-      <w:r>
-        <w:drawing>
-          <wp:inline distT="0" distB="0" distL="0" distR="0">
-            <wp:extent cx="4381500" cy="1133475"/>
-            <wp:effectExtent t="0" r="0" b="0" l="0"/>
-            <wp:docPr id="1" name="" descr="" title=""/>
-            <wp:cNvGraphicFramePr>
-              <a:graphicFrameLocks xmlns:a="http://schemas.openxmlformats.org/drawingml/2006/main" noChangeAspect="1"/>
-            </wp:cNvGraphicFramePr>
-            <a:graphic xmlns:a="http://schemas.openxmlformats.org/drawingml/2006/main">
-              <a:graphicData uri="http://schemas.openxmlformats.org/drawingml/2006/picture">
-                <pic:pic xmlns:pic="http://schemas.openxmlformats.org/drawingml/2006/picture">
-                  <pic:nvPicPr>
-                    <pic:cNvPr id="0" name="" descr=""/>
-                    <pic:cNvPicPr>
-                      <a:picLocks noChangeAspect="1" noChangeArrowheads="1"/>
-                    </pic:cNvPicPr>
-                  </pic:nvPicPr>
-                  <pic:blipFill>
-                    <a:blip r:embed="rId12" cstate="none"/>
-                    <a:srcRect/>
-                    <a:stretch>
-                      <a:fillRect/>
-                    </a:stretch>
-                  </pic:blipFill>
-                  <pic:spPr bwMode="auto">
-                    <a:xfrm>
-                      <a:off x="0" y="0"/>
-                      <a:ext cx="4381500" cy="1133475"/>
-                    </a:xfrm>
-                    <a:prstGeom prst="rect">
-                      <a:avLst/>
-                    </a:prstGeom>
-                  </pic:spPr>
-                </pic:pic>
-              </a:graphicData>
-            </a:graphic>
-          </wp:inline>
-        </w:drawing>
-      </w:r>
-    </w:p>
-    <w:p>
-      <w:pPr>
-        <w:spacing w:after="200"/>
-      </w:pPr>
-      <w:r>
-        <w:rPr>
-          <w:color w:val="444444"/>
-          <w:sz w:val="18"/>
-          <w:szCs w:val="18"/>
-        </w:rPr>
-        <w:t xml:space="preserve">Observed against predicted log error per row, m2, with the 95% predictive interval. Coverage per protocol below.</w:t>
+        <w:t xml:space="preserve">Fit and convergence, m2 (fit_quality.png). (a) Posterior predictive check: observed density of log squared error per protocol (black) against 40 replicated datasets (grey). (b) Observed against predicted log error per row with the 95% predictive interval (grey bars) and the identity (dashed). (c) Sampler and LOO diagnostics: traces of the five protocol effects, four chains overlaid; r_hat per parameter family with bulk ESS as marker size, dashed line at 1.01; Pareto-k per observation by protocol, dashed lines at 0.7 and 1. Title line: the scalar summary. The three rows are also written separately as predictive.png, fit.png and convergence.png.</w:t>
       </w:r>
     </w:p>
     <w:tbl>
@@ -9221,7 +9162,7 @@
         <w:spacing w:after="60"/>
       </w:pPr>
       <w:r>
-        <w:t xml:space="preserve">Figures: analysis/results/figures/bars/figure1_score_box (paper), figure1_{mse,delta,ratio,score}; analysis/results/figures/signal_glm/{ratios,ratios_table,posteriors,contrasts,predictive,fit}.</w:t>
+        <w:t xml:space="preserve">Figures: analysis/results/figures/bars/figure1_score_box (paper), figure1_{mse,delta,ratio,score}; analysis/results/figures/signal_glm/{ratios,ratios_table,posteriors,posteriors_score,contrasts,fit_quality,convergence,predictive,fit}.</w:t>
       </w:r>
     </w:p>
     <w:p>

</xml_diff>